<commit_message>
Mise à jour du 07 oct 2026
</commit_message>
<xml_diff>
--- a/CONVENTION COLLECTIVE REVISEE JANVIER 2019 - V2.docx
+++ b/CONVENTION COLLECTIVE REVISEE JANVIER 2019 - V2.docx
@@ -835,23 +835,13 @@
         </w:rPr>
         <w:t xml:space="preserve">-  </w:t>
       </w:r>
-      <w:proofErr w:type="spellStart"/>
-      <w:r>
-        <w:rPr>
-          <w:rFonts w:cs="Arial"/>
-          <w:szCs w:val="22"/>
-          <w:lang w:val="fr-BE"/>
-        </w:rPr>
-        <w:t>Leuticia</w:t>
-      </w:r>
-      <w:proofErr w:type="spellEnd"/>
-      <w:r>
-        <w:rPr>
-          <w:rFonts w:cs="Arial"/>
-          <w:szCs w:val="22"/>
-          <w:lang w:val="fr-BE"/>
-        </w:rPr>
-        <w:t xml:space="preserve"> KHUNDA MAVUNGU</w:t>
+      <w:r>
+        <w:rPr>
+          <w:rFonts w:cs="Arial"/>
+          <w:szCs w:val="22"/>
+          <w:lang w:val="fr-BE"/>
+        </w:rPr>
+        <w:t>Leuticia KHUNDA MAVUNGU</w:t>
       </w:r>
       <w:r>
         <w:rPr>
@@ -1774,15 +1764,7 @@
           <w:rFonts w:cs="Arial"/>
           <w:b/>
         </w:rPr>
-        <w:t xml:space="preserve">chapitre </w:t>
-      </w:r>
-      <w:proofErr w:type="spellStart"/>
-      <w:r>
-        <w:rPr>
-          <w:rFonts w:cs="Arial"/>
-          <w:b/>
-        </w:rPr>
-        <w:t>IV</w:t>
+        <w:t>chapitre IV</w:t>
       </w:r>
       <w:r>
         <w:rPr>
@@ -1822,7 +1804,6 @@
         </w:rPr>
         <w:t>I</w:t>
       </w:r>
-      <w:proofErr w:type="spellEnd"/>
       <w:r>
         <w:rPr>
           <w:rFonts w:cs="Arial"/>
@@ -7157,25 +7138,7 @@
           <w:szCs w:val="22"/>
           <w:lang w:val="fr-BE"/>
         </w:rPr>
-        <w:t>12/CAB/MIN/TPS/</w:t>
-      </w:r>
-      <w:proofErr w:type="spellStart"/>
-      <w:r>
-        <w:rPr>
-          <w:rFonts w:cs="Arial"/>
-          <w:szCs w:val="22"/>
-          <w:lang w:val="fr-BE"/>
-        </w:rPr>
-        <w:t>ar</w:t>
-      </w:r>
-      <w:proofErr w:type="spellEnd"/>
-      <w:r>
-        <w:rPr>
-          <w:rFonts w:cs="Arial"/>
-          <w:szCs w:val="22"/>
-          <w:lang w:val="fr-BE"/>
-        </w:rPr>
-        <w:t xml:space="preserve">/054 </w:t>
+        <w:t xml:space="preserve">12/CAB/MIN/TPS/ar/054 </w:t>
       </w:r>
       <w:r>
         <w:rPr>
@@ -7977,23 +7940,13 @@
           <w:lang w:val="fr-BE"/>
         </w:rPr>
       </w:pPr>
-      <w:proofErr w:type="spellStart"/>
-      <w:r>
-        <w:rPr>
-          <w:rFonts w:cs="Arial"/>
-          <w:szCs w:val="22"/>
-          <w:lang w:val="fr-BE"/>
-        </w:rPr>
-        <w:t>Encas</w:t>
-      </w:r>
-      <w:proofErr w:type="spellEnd"/>
-      <w:r>
-        <w:rPr>
-          <w:rFonts w:cs="Arial"/>
-          <w:szCs w:val="22"/>
-          <w:lang w:val="fr-BE"/>
-        </w:rPr>
-        <w:t xml:space="preserve"> de </w:t>
+      <w:r>
+        <w:rPr>
+          <w:rFonts w:cs="Arial"/>
+          <w:szCs w:val="22"/>
+          <w:lang w:val="fr-BE"/>
+        </w:rPr>
+        <w:t xml:space="preserve">Encas de </w:t>
       </w:r>
       <w:r>
         <w:rPr>
@@ -8820,23 +8773,13 @@
         </w:rPr>
         <w:tab/>
       </w:r>
-      <w:proofErr w:type="spellStart"/>
-      <w:r>
-        <w:rPr>
-          <w:rFonts w:cs="Arial"/>
-          <w:szCs w:val="22"/>
-          <w:lang w:val="fr-BE"/>
-        </w:rPr>
-        <w:t>Etre</w:t>
-      </w:r>
-      <w:proofErr w:type="spellEnd"/>
-      <w:r>
-        <w:rPr>
-          <w:rFonts w:cs="Arial"/>
-          <w:szCs w:val="22"/>
-          <w:lang w:val="fr-BE"/>
-        </w:rPr>
-        <w:t xml:space="preserve"> âgé de </w:t>
+      <w:r>
+        <w:rPr>
+          <w:rFonts w:cs="Arial"/>
+          <w:szCs w:val="22"/>
+          <w:lang w:val="fr-BE"/>
+        </w:rPr>
+        <w:t xml:space="preserve">Etre âgé de </w:t>
       </w:r>
       <w:r>
         <w:rPr>
@@ -8904,23 +8847,13 @@
         </w:rPr>
         <w:tab/>
       </w:r>
-      <w:proofErr w:type="spellStart"/>
-      <w:r>
-        <w:rPr>
-          <w:rFonts w:cs="Arial"/>
-          <w:szCs w:val="22"/>
-          <w:lang w:val="fr-BE"/>
-        </w:rPr>
-        <w:t>Etre</w:t>
-      </w:r>
-      <w:proofErr w:type="spellEnd"/>
-      <w:r>
-        <w:rPr>
-          <w:rFonts w:cs="Arial"/>
-          <w:szCs w:val="22"/>
-          <w:lang w:val="fr-BE"/>
-        </w:rPr>
-        <w:t xml:space="preserve"> porteur d’un diplôme ou certificat pris en considération pour l’engagement au</w:t>
+      <w:r>
+        <w:rPr>
+          <w:rFonts w:cs="Arial"/>
+          <w:szCs w:val="22"/>
+          <w:lang w:val="fr-BE"/>
+        </w:rPr>
+        <w:t>Etre porteur d’un diplôme ou certificat pris en considération pour l’engagement au</w:t>
       </w:r>
     </w:p>
     <w:p>
@@ -12793,16 +12726,7 @@
           <w:szCs w:val="22"/>
           <w:lang w:val="fr-BE"/>
         </w:rPr>
-        <w:t xml:space="preserve">Les </w:t>
-      </w:r>
-      <w:proofErr w:type="spellStart"/>
-      <w:r>
-        <w:rPr>
-          <w:rFonts w:cs="Arial"/>
-          <w:szCs w:val="22"/>
-          <w:lang w:val="fr-BE"/>
-        </w:rPr>
-        <w:t>parti</w:t>
+        <w:t>Les parti</w:t>
       </w:r>
       <w:r>
         <w:rPr>
@@ -12818,16 +12742,7 @@
           <w:szCs w:val="22"/>
           <w:lang w:val="fr-BE"/>
         </w:rPr>
-        <w:t>es</w:t>
-      </w:r>
-      <w:proofErr w:type="spellEnd"/>
-      <w:r>
-        <w:rPr>
-          <w:rFonts w:cs="Arial"/>
-          <w:szCs w:val="22"/>
-          <w:lang w:val="fr-BE"/>
-        </w:rPr>
-        <w:t xml:space="preserve"> conviennent que pour le sarclage et </w:t>
+        <w:t xml:space="preserve">es conviennent que pour le sarclage et </w:t>
       </w:r>
       <w:r>
         <w:rPr>
@@ -13876,7 +13791,7 @@
         <w:rPr>
           <w:lang w:val="fr-BE"/>
         </w:rPr>
-        <w:t xml:space="preserve"> 72 heures   qui </w:t>
+        <w:t xml:space="preserve"> 72 heures qui </w:t>
       </w:r>
       <w:r>
         <w:rPr>
@@ -20914,30 +20829,14 @@
           <w:rFonts w:cs="Arial"/>
           <w:szCs w:val="22"/>
         </w:rPr>
-        <w:t xml:space="preserve">Il est convoqué </w:t>
-      </w:r>
-      <w:proofErr w:type="spellStart"/>
-      <w:r>
-        <w:rPr>
-          <w:rFonts w:cs="Arial"/>
-          <w:szCs w:val="22"/>
-        </w:rPr>
-        <w:t>par</w:t>
-      </w:r>
-      <w:r>
-        <w:rPr>
-          <w:rFonts w:cs="Arial"/>
-          <w:szCs w:val="22"/>
-        </w:rPr>
-        <w:t>la</w:t>
-      </w:r>
-      <w:proofErr w:type="spellEnd"/>
-      <w:r>
-        <w:rPr>
-          <w:rFonts w:cs="Arial"/>
-          <w:szCs w:val="22"/>
-        </w:rPr>
-        <w:t xml:space="preserve"> Direction du personnel</w:t>
+        <w:t>Il est convoqué par</w:t>
+      </w:r>
+      <w:r>
+        <w:rPr>
+          <w:rFonts w:cs="Arial"/>
+          <w:szCs w:val="22"/>
+        </w:rPr>
+        <w:t>la Direction du personnel</w:t>
       </w:r>
       <w:r>
         <w:rPr>
@@ -21173,33 +21072,15 @@
           <w:szCs w:val="22"/>
           <w:lang w:val="fr-BE"/>
         </w:rPr>
-        <w:t xml:space="preserve"> pour une </w:t>
-      </w:r>
-      <w:proofErr w:type="spellStart"/>
-      <w:r>
-        <w:rPr>
-          <w:rFonts w:cs="Arial"/>
-          <w:szCs w:val="22"/>
-          <w:lang w:val="fr-BE"/>
-        </w:rPr>
-        <w:t>enqu</w:t>
-      </w:r>
-      <w:r>
-        <w:rPr>
-          <w:rFonts w:cs="Arial"/>
-          <w:szCs w:val="22"/>
-          <w:lang w:val="fr-BE"/>
-        </w:rPr>
-        <w:t>êteet</w:t>
-      </w:r>
-      <w:proofErr w:type="spellEnd"/>
-      <w:r>
-        <w:rPr>
-          <w:rFonts w:cs="Arial"/>
-          <w:szCs w:val="22"/>
-          <w:lang w:val="fr-BE"/>
-        </w:rPr>
-        <w:t xml:space="preserve"> avis immédiats</w:t>
+        <w:t xml:space="preserve"> pour une enqu</w:t>
+      </w:r>
+      <w:r>
+        <w:rPr>
+          <w:rFonts w:cs="Arial"/>
+          <w:szCs w:val="22"/>
+          <w:lang w:val="fr-BE"/>
+        </w:rPr>
+        <w:t>êteet avis immédiats</w:t>
       </w:r>
       <w:r>
         <w:rPr>
@@ -21253,16 +21134,7 @@
           <w:szCs w:val="22"/>
           <w:lang w:val="fr-BE"/>
         </w:rPr>
-        <w:t xml:space="preserve">de 24 heures sans avis </w:t>
-      </w:r>
-      <w:proofErr w:type="spellStart"/>
-      <w:r>
-        <w:rPr>
-          <w:rFonts w:cs="Arial"/>
-          <w:szCs w:val="22"/>
-          <w:lang w:val="fr-BE"/>
-        </w:rPr>
-        <w:t>de</w:t>
+        <w:t>de 24 heures sans avis de</w:t>
       </w:r>
       <w:smartTag w:uri="urn:schemas-microsoft-com:office:smarttags" w:element="PersonName">
         <w:smartTagPr>
@@ -21278,16 +21150,7 @@
               <w:szCs w:val="22"/>
               <w:lang w:val="fr-BE"/>
             </w:rPr>
-            <w:t>la</w:t>
-          </w:r>
-          <w:proofErr w:type="spellEnd"/>
-          <w:r>
-            <w:rPr>
-              <w:rFonts w:cs="Arial"/>
-              <w:szCs w:val="22"/>
-              <w:lang w:val="fr-BE"/>
-            </w:rPr>
-            <w:t xml:space="preserve"> Délégation</w:t>
+            <w:t>la Délégation</w:t>
           </w:r>
         </w:smartTag>
         <w:r>
@@ -21725,25 +21588,7 @@
           <w:szCs w:val="22"/>
           <w:lang w:val="fr-BE"/>
         </w:rPr>
-        <w:t xml:space="preserve">du Code du Travail, </w:t>
-      </w:r>
-      <w:proofErr w:type="spellStart"/>
-      <w:r>
-        <w:rPr>
-          <w:rFonts w:cs="Arial"/>
-          <w:szCs w:val="22"/>
-          <w:lang w:val="fr-BE"/>
-        </w:rPr>
-        <w:t>sontnotamment</w:t>
-      </w:r>
-      <w:proofErr w:type="spellEnd"/>
-      <w:r>
-        <w:rPr>
-          <w:rFonts w:cs="Arial"/>
-          <w:szCs w:val="22"/>
-          <w:lang w:val="fr-BE"/>
-        </w:rPr>
-        <w:t xml:space="preserve"> considérés </w:t>
+        <w:t xml:space="preserve">du Code du Travail, sontnotamment considérés </w:t>
       </w:r>
     </w:p>
     <w:p>
@@ -22859,7 +22704,6 @@
         </w:rPr>
         <w:t xml:space="preserve"> éventuellement </w:t>
       </w:r>
-      <w:proofErr w:type="spellStart"/>
       <w:r>
         <w:rPr>
           <w:rFonts w:cs="Arial"/>
@@ -22882,16 +22726,7 @@
           <w:szCs w:val="22"/>
           <w:lang w:val="fr-BE"/>
         </w:rPr>
-        <w:t>d’un</w:t>
-      </w:r>
-      <w:proofErr w:type="spellEnd"/>
-      <w:r>
-        <w:rPr>
-          <w:rFonts w:cs="Arial"/>
-          <w:szCs w:val="22"/>
-          <w:lang w:val="fr-BE"/>
-        </w:rPr>
-        <w:t xml:space="preserve"> Permanent Syndical.</w:t>
+        <w:t>d’un Permanent Syndical.</w:t>
       </w:r>
     </w:p>
     <w:p>
@@ -23852,25 +23687,7 @@
           <w:lang w:val="fr-BE"/>
         </w:rPr>
         <w:lastRenderedPageBreak/>
-        <w:t xml:space="preserve">Lorsque une réduction du personnel est envisagée à </w:t>
-      </w:r>
-      <w:proofErr w:type="spellStart"/>
-      <w:r>
-        <w:rPr>
-          <w:rFonts w:cs="Arial"/>
-          <w:szCs w:val="22"/>
-          <w:lang w:val="fr-BE"/>
-        </w:rPr>
-        <w:t>lasuite</w:t>
-      </w:r>
-      <w:proofErr w:type="spellEnd"/>
-      <w:r>
-        <w:rPr>
-          <w:rFonts w:cs="Arial"/>
-          <w:szCs w:val="22"/>
-          <w:lang w:val="fr-BE"/>
-        </w:rPr>
-        <w:t xml:space="preserve"> d’une réorganisation de la     </w:t>
+        <w:t xml:space="preserve">Lorsque une réduction du personnel est envisagée à lasuite d’une réorganisation de la     </w:t>
       </w:r>
     </w:p>
     <w:p>
@@ -28060,18 +27877,8 @@
           <w:szCs w:val="22"/>
           <w:lang w:val="fr-BE"/>
         </w:rPr>
-        <w:t xml:space="preserve">que jusqu’à concurrence de </w:t>
-      </w:r>
-      <w:proofErr w:type="spellStart"/>
-      <w:r>
-        <w:rPr>
-          <w:rFonts w:cs="Arial"/>
-          <w:szCs w:val="22"/>
-          <w:lang w:val="fr-BE"/>
-        </w:rPr>
-        <w:t>dix huit</w:t>
-      </w:r>
-      <w:proofErr w:type="spellEnd"/>
+        <w:t>que jusqu’à concurrence de dix huit</w:t>
+      </w:r>
       <w:r>
         <w:rPr>
           <w:rFonts w:cs="Arial"/>
@@ -28995,73 +28802,33 @@
           <w:u w:val="single"/>
           <w:lang w:val="fr-BE"/>
         </w:rPr>
-        <w:t xml:space="preserve"> et achat 1 sac de sucre de 50 </w:t>
-      </w:r>
-      <w:proofErr w:type="spellStart"/>
-      <w:r>
-        <w:rPr>
-          <w:rFonts w:cs="Arial"/>
-          <w:b/>
-          <w:szCs w:val="22"/>
-          <w:u w:val="single"/>
-          <w:lang w:val="fr-BE"/>
-        </w:rPr>
-        <w:t>kgs</w:t>
-      </w:r>
-      <w:proofErr w:type="spellEnd"/>
-      <w:r>
-        <w:rPr>
-          <w:rFonts w:cs="Arial"/>
-          <w:b/>
-          <w:szCs w:val="22"/>
-          <w:u w:val="single"/>
-          <w:lang w:val="fr-BE"/>
-        </w:rPr>
-        <w:t>.</w:t>
-      </w:r>
-    </w:p>
-    <w:p>
-      <w:pPr>
-        <w:rPr>
-          <w:rFonts w:cs="Arial"/>
-          <w:szCs w:val="22"/>
-          <w:lang w:val="fr-BE"/>
-        </w:rPr>
-      </w:pPr>
-    </w:p>
-    <w:p>
-      <w:pPr>
-        <w:rPr>
-          <w:rFonts w:cs="Arial"/>
-          <w:szCs w:val="22"/>
-          <w:lang w:val="fr-BE"/>
-        </w:rPr>
-      </w:pPr>
-      <w:r>
-        <w:rPr>
-          <w:rFonts w:cs="Arial"/>
-          <w:szCs w:val="22"/>
-          <w:lang w:val="fr-BE"/>
-        </w:rPr>
-        <w:t xml:space="preserve">L’Employeur octroie gratuitement à chaque travailleur 10 </w:t>
-      </w:r>
-      <w:proofErr w:type="spellStart"/>
-      <w:r>
-        <w:rPr>
-          <w:rFonts w:cs="Arial"/>
-          <w:szCs w:val="22"/>
-          <w:lang w:val="fr-BE"/>
-        </w:rPr>
-        <w:t>kgs</w:t>
-      </w:r>
-      <w:proofErr w:type="spellEnd"/>
-      <w:r>
-        <w:rPr>
-          <w:rFonts w:cs="Arial"/>
-          <w:szCs w:val="22"/>
-          <w:lang w:val="fr-BE"/>
-        </w:rPr>
-        <w:t xml:space="preserve"> de sucre </w:t>
+        <w:t xml:space="preserve"> et achat 1 sac de sucre de 50 kgs.</w:t>
+      </w:r>
+    </w:p>
+    <w:p>
+      <w:pPr>
+        <w:rPr>
+          <w:rFonts w:cs="Arial"/>
+          <w:szCs w:val="22"/>
+          <w:lang w:val="fr-BE"/>
+        </w:rPr>
+      </w:pPr>
+    </w:p>
+    <w:p>
+      <w:pPr>
+        <w:rPr>
+          <w:rFonts w:cs="Arial"/>
+          <w:szCs w:val="22"/>
+          <w:lang w:val="fr-BE"/>
+        </w:rPr>
+      </w:pPr>
+      <w:r>
+        <w:rPr>
+          <w:rFonts w:cs="Arial"/>
+          <w:szCs w:val="22"/>
+          <w:lang w:val="fr-BE"/>
+        </w:rPr>
+        <w:t xml:space="preserve">L’Employeur octroie gratuitement à chaque travailleur 10 kgs de sucre </w:t>
       </w:r>
       <w:r>
         <w:rPr>
@@ -29095,25 +28862,7 @@
           <w:szCs w:val="22"/>
           <w:lang w:val="fr-BE"/>
         </w:rPr>
-        <w:t xml:space="preserve">La société vend également à chaque travailleur, chaque mois, 1 sac de sucre de 50 </w:t>
-      </w:r>
-      <w:proofErr w:type="spellStart"/>
-      <w:r>
-        <w:rPr>
-          <w:rFonts w:cs="Arial"/>
-          <w:szCs w:val="22"/>
-          <w:lang w:val="fr-BE"/>
-        </w:rPr>
-        <w:t>kgs</w:t>
-      </w:r>
-      <w:proofErr w:type="spellEnd"/>
-      <w:r>
-        <w:rPr>
-          <w:rFonts w:cs="Arial"/>
-          <w:szCs w:val="22"/>
-          <w:lang w:val="fr-BE"/>
-        </w:rPr>
-        <w:t xml:space="preserve"> à un prix social.</w:t>
+        <w:t>La société vend également à chaque travailleur, chaque mois, 1 sac de sucre de 50 kgs à un prix social.</w:t>
       </w:r>
     </w:p>
     <w:p>
@@ -30660,18 +30409,8 @@
           <w:szCs w:val="22"/>
           <w:lang w:val="fr-BE"/>
         </w:rPr>
-        <w:t xml:space="preserve">un prime inférieur ou supérieur au 13 </w:t>
-      </w:r>
-      <w:proofErr w:type="spellStart"/>
-      <w:r>
-        <w:rPr>
-          <w:rFonts w:cs="Arial"/>
-          <w:szCs w:val="22"/>
-          <w:lang w:val="fr-BE"/>
-        </w:rPr>
-        <w:t>ème</w:t>
-      </w:r>
-      <w:proofErr w:type="spellEnd"/>
+        <w:t>un prime inférieur ou supérieur au 13 ème</w:t>
+      </w:r>
       <w:r>
         <w:rPr>
           <w:rFonts w:cs="Arial"/>
@@ -32169,25 +31908,7 @@
           <w:szCs w:val="22"/>
           <w:lang w:val="fr-BE"/>
         </w:rPr>
-        <w:t xml:space="preserve"> intervient dans les autres frais de circonstance </w:t>
-      </w:r>
-      <w:proofErr w:type="spellStart"/>
-      <w:r>
-        <w:rPr>
-          <w:rFonts w:cs="Arial"/>
-          <w:szCs w:val="22"/>
-          <w:lang w:val="fr-BE"/>
-        </w:rPr>
-        <w:t>pourdécès</w:t>
-      </w:r>
-      <w:proofErr w:type="spellEnd"/>
-      <w:r>
-        <w:rPr>
-          <w:rFonts w:cs="Arial"/>
-          <w:szCs w:val="22"/>
-          <w:lang w:val="fr-BE"/>
-        </w:rPr>
-        <w:t xml:space="preserve">  qui</w:t>
+        <w:t xml:space="preserve"> intervient dans les autres frais de circonstance pourdécès  qui</w:t>
       </w:r>
     </w:p>
     <w:p>
@@ -32524,25 +32245,7 @@
           <w:szCs w:val="22"/>
           <w:lang w:val="fr-BE"/>
         </w:rPr>
-        <w:t xml:space="preserve">Les </w:t>
-      </w:r>
-      <w:proofErr w:type="spellStart"/>
-      <w:r>
-        <w:rPr>
-          <w:rFonts w:cs="Arial"/>
-          <w:szCs w:val="22"/>
-          <w:lang w:val="fr-BE"/>
-        </w:rPr>
-        <w:t>ayants-droit</w:t>
-      </w:r>
-      <w:proofErr w:type="spellEnd"/>
-      <w:r>
-        <w:rPr>
-          <w:rFonts w:cs="Arial"/>
-          <w:szCs w:val="22"/>
-          <w:lang w:val="fr-BE"/>
-        </w:rPr>
-        <w:t xml:space="preserve"> aux soins médicaux pour compte du travailleur</w:t>
+        <w:t>Les ayants-droit aux soins médicaux pour compte du travailleur</w:t>
       </w:r>
       <w:r>
         <w:rPr>

</xml_diff>